<commit_message>
update 25 -13- 05
</commit_message>
<xml_diff>
--- a/artifacts/reports/architecture/ARCH-03_タブレットPOS_デバイス接続サーバー構造設計書/ARCH-03_タブレットPOS_デバイス接続サーバー構造設計書.docx
+++ b/artifacts/reports/architecture/ARCH-03_タブレットPOS_デバイス接続サーバー構造設計書/ARCH-03_タブレットPOS_デバイス接続サーバー構造設計書.docx
@@ -42,18 +42,46 @@
         <w:pBdr>
           <w:top w:val="single" w:sz="6" w:space="6" w:color="BFBFBF"/>
           <w:left w:val="single" w:sz="6" w:space="6" w:color="BFBFBF"/>
+          <w:right w:val="single" w:sz="6" w:space="6" w:color="BFBFBF"/>
+        </w:pBdr>
+        <w:shd w:val="clear" w:color="auto" w:fill="F2F2F2"/>
+        <w:spacing w:before="120" w:after="0" w:line="600" w:lineRule="exact"/>
+        <w:jc w:val="center"/>
+        <w:rPr>
+          <w:rFonts w:ascii="Meiryo UI" w:eastAsia="Meiryo UI" w:hAnsi="Meiryo UI" w:cs="Meiryo UI" w:hint="eastAsia"/>
+          <w:b/>
+          <w:color w:val="595959"/>
+          <w:sz w:val="52"/>
+          <w:szCs w:val="52"/>
+        </w:rPr>
+      </w:pPr>
+      <w:r>
+        <w:rPr>
+          <w:rFonts w:ascii="Meiryo UI" w:eastAsia="Meiryo UI" w:hAnsi="Meiryo UI" w:cs="Meiryo UI" w:hint="eastAsia"/>
+          <w:b/>
+          <w:color w:val="595959"/>
+          <w:sz w:val="52"/>
+          <w:szCs w:val="52"/>
+        </w:rPr>
+        <w:t>タブレットPOS</w:t>
+      </w:r>
+    </w:p>
+    <w:p>
+      <w:pPr>
+        <w:pBdr>
+          <w:left w:val="single" w:sz="6" w:space="6" w:color="BFBFBF"/>
           <w:bottom w:val="single" w:sz="6" w:space="6" w:color="BFBFBF"/>
           <w:right w:val="single" w:sz="6" w:space="6" w:color="BFBFBF"/>
         </w:pBdr>
         <w:shd w:val="clear" w:color="auto" w:fill="F2F2F2"/>
-        <w:spacing w:before="120" w:after="120" w:line="600" w:lineRule="exact"/>
+        <w:spacing w:before="0" w:after="120" w:line="600" w:lineRule="exact"/>
         <w:jc w:val="center"/>
         <w:rPr>
           <w:rFonts w:ascii="Meiryo UI" w:eastAsia="Meiryo UI" w:hAnsi="Meiryo UI" w:cs="Meiryo UI" w:hint="eastAsia"/>
           <w:b/>
           <w:color w:val="595959"/>
-          <w:sz w:val="44"/>
-          <w:szCs w:val="44"/>
+          <w:sz w:val="40"/>
+          <w:szCs w:val="40"/>
         </w:rPr>
       </w:pPr>
       <w:r>
@@ -61,10 +89,10 @@
           <w:rFonts w:ascii="Meiryo UI" w:eastAsia="Meiryo UI" w:hAnsi="Meiryo UI" w:cs="Meiryo UI" w:hint="eastAsia"/>
           <w:b/>
           <w:color w:val="595959"/>
-          <w:sz w:val="44"/>
-          <w:szCs w:val="44"/>
-        </w:rPr>
-        <w:t>ARCH-03_タブレットPOS_デバイス接続サーバー構造設計書</w:t>
+          <w:sz w:val="40"/>
+          <w:szCs w:val="40"/>
+        </w:rPr>
+        <w:t>デバイス接続サーバー構造設計書</w:t>
       </w:r>
     </w:p>
     <w:p>
@@ -108,7 +136,7 @@
           <w:sz w:val="28"/>
           <w:szCs w:val="28"/>
         </w:rPr>
-        <w:t xml:space="preserve">第1.0.0版</w:t>
+        <w:t xml:space="preserve">第1.0.1版</w:t>
       </w:r>
     </w:p>
     <w:p>
@@ -131,7 +159,7 @@
           <w:sz w:val="24"/>
           <w:szCs w:val="24"/>
         </w:rPr>
-        <w:t xml:space="preserve">2026/06/19</w:t>
+        <w:t xml:space="preserve">2026/06/24</w:t>
       </w:r>
     </w:p>
     <w:p>
@@ -177,11 +205,11 @@
         <w:tblLook w:val="04A0" w:firstRow="1" w:lastRow="0" w:firstColumn="1" w:lastColumn="0" w:noHBand="0" w:noVBand="1"/>
       </w:tblPr>
       <w:tblGrid>
+        <w:gridCol w:w="795"/>
         <w:gridCol w:w="760"/>
+        <w:gridCol w:w="6562"/>
         <w:gridCol w:w="760"/>
-        <w:gridCol w:w="6598"/>
-        <w:gridCol w:w="760"/>
-        <w:gridCol w:w="760"/>
+        <w:gridCol w:w="761"/>
       </w:tblGrid>
       <w:tr>
         <w:trPr>
@@ -189,7 +217,7 @@
         </w:trPr>
         <w:tc>
           <w:tcPr>
-            <w:tcW w:w="760" w:type="dxa"/>
+            <w:tcW w:w="795" w:type="dxa"/>
             <w:tcBorders>
               <w:top w:val="single" w:sz="4" w:space="0" w:color="C6C6C6"/>
               <w:left w:val="single" w:sz="4" w:space="0" w:color="C6C6C6"/>
@@ -265,7 +293,7 @@
         </w:tc>
         <w:tc>
           <w:tcPr>
-            <w:tcW w:w="6598" w:type="dxa"/>
+            <w:tcW w:w="6562" w:type="dxa"/>
             <w:tcBorders>
               <w:top w:val="single" w:sz="4" w:space="0" w:color="C6C6C6"/>
               <w:left w:val="single" w:sz="4" w:space="0" w:color="C6C6C6"/>
@@ -341,7 +369,7 @@
         </w:tc>
         <w:tc>
           <w:tcPr>
-            <w:tcW w:w="760" w:type="dxa"/>
+            <w:tcW w:w="761" w:type="dxa"/>
             <w:tcBorders>
               <w:top w:val="single" w:sz="4" w:space="0" w:color="C6C6C6"/>
               <w:left w:val="single" w:sz="4" w:space="0" w:color="C6C6C6"/>
@@ -381,7 +409,7 @@
       <w:tr>
         <w:tc>
           <w:tcPr>
-            <w:tcW w:w="760" w:type="dxa"/>
+            <w:tcW w:w="795" w:type="dxa"/>
             <w:tcBorders>
               <w:top w:val="single" w:sz="4" w:space="0" w:color="C6C6C6"/>
               <w:left w:val="single" w:sz="4" w:space="0" w:color="C6C6C6"/>
@@ -411,7 +439,7 @@
                 <w:sz w:val="18"/>
                 <w:szCs w:val="18"/>
               </w:rPr>
-              <w:t xml:space="preserve">2026/06/24</w:t>
+              <w:t xml:space="preserve">2026/06/19</w:t>
             </w:r>
           </w:p>
         </w:tc>
@@ -447,13 +475,13 @@
                 <w:sz w:val="18"/>
                 <w:szCs w:val="18"/>
               </w:rPr>
-              <w:t xml:space="preserve">1.0.1</w:t>
+              <w:t xml:space="preserve">1.0.0</w:t>
             </w:r>
           </w:p>
         </w:tc>
         <w:tc>
           <w:tcPr>
-            <w:tcW w:w="6598" w:type="dxa"/>
+            <w:tcW w:w="6562" w:type="dxa"/>
             <w:tcBorders>
               <w:top w:val="single" w:sz="4" w:space="0" w:color="C6C6C6"/>
               <w:left w:val="single" w:sz="4" w:space="0" w:color="C6C6C6"/>
@@ -483,7 +511,7 @@
                 <w:sz w:val="18"/>
                 <w:szCs w:val="18"/>
               </w:rPr>
-              <w:t xml:space="preserve">デバイス接続サーバーを中心とする構造に見直し、DeviceCtrl は呼び出し境界として整理</w:t>
+              <w:t xml:space="preserve">タブレットPOS ソフトウェア全体構造設計書の構成に合わせ、DeviceManager / DeviceCtrl / 制御方式選択 / 生成処理 / デバイスインターフェースの構成と責務を定義</w:t>
             </w:r>
           </w:p>
         </w:tc>
@@ -525,7 +553,7 @@
         </w:tc>
         <w:tc>
           <w:tcPr>
-            <w:tcW w:w="760" w:type="dxa"/>
+            <w:tcW w:w="761" w:type="dxa"/>
             <w:tcBorders>
               <w:top w:val="single" w:sz="4" w:space="0" w:color="C6C6C6"/>
               <w:left w:val="single" w:sz="4" w:space="0" w:color="C6C6C6"/>
@@ -563,7 +591,7 @@
       <w:tr>
         <w:tc>
           <w:tcPr>
-            <w:tcW w:w="760" w:type="dxa"/>
+            <w:tcW w:w="795" w:type="dxa"/>
             <w:tcBorders>
               <w:top w:val="single" w:sz="4" w:space="0" w:color="C6C6C6"/>
               <w:left w:val="single" w:sz="4" w:space="0" w:color="C6C6C6"/>
@@ -593,7 +621,7 @@
                 <w:sz w:val="18"/>
                 <w:szCs w:val="18"/>
               </w:rPr>
-              <w:t xml:space="preserve">2026/06/19</w:t>
+              <w:t xml:space="preserve">2026/06/24</w:t>
             </w:r>
           </w:p>
         </w:tc>
@@ -629,13 +657,13 @@
                 <w:sz w:val="18"/>
                 <w:szCs w:val="18"/>
               </w:rPr>
-              <w:t xml:space="preserve">1.0.0</w:t>
+              <w:t xml:space="preserve">1.0.1</w:t>
             </w:r>
           </w:p>
         </w:tc>
         <w:tc>
           <w:tcPr>
-            <w:tcW w:w="6598" w:type="dxa"/>
+            <w:tcW w:w="6562" w:type="dxa"/>
             <w:tcBorders>
               <w:top w:val="single" w:sz="4" w:space="0" w:color="C6C6C6"/>
               <w:left w:val="single" w:sz="4" w:space="0" w:color="C6C6C6"/>
@@ -665,7 +693,7 @@
                 <w:sz w:val="18"/>
                 <w:szCs w:val="18"/>
               </w:rPr>
-              <w:t xml:space="preserve">タブレットPOS ソフトウェア全体構造設計書の構成に合わせ、DeviceManager / DeviceCtrl / Strategy / Factory / Device Interface の構成と責務を定義</w:t>
+              <w:t xml:space="preserve">デバイス接続サーバーを中心とする構造に見直し、デバイス制御層（DeviceCtrl）は呼び出し境界として整理</w:t>
             </w:r>
           </w:p>
         </w:tc>
@@ -707,7 +735,7 @@
         </w:tc>
         <w:tc>
           <w:tcPr>
-            <w:tcW w:w="760" w:type="dxa"/>
+            <w:tcW w:w="761" w:type="dxa"/>
             <w:tcBorders>
               <w:top w:val="single" w:sz="4" w:space="0" w:color="C6C6C6"/>
               <w:left w:val="single" w:sz="4" w:space="0" w:color="C6C6C6"/>
@@ -1002,7 +1030,7 @@
             <w:rFonts w:ascii="Meiryo UI" w:eastAsia="Meiryo UI" w:hAnsi="Meiryo UI" w:cs="Meiryo UI" w:hint="eastAsia"/>
             <w:noProof/>
           </w:rPr>
-          <w:t xml:space="preserve">2.3 DeviceCtrl との境界</w:t>
+          <w:t xml:space="preserve">2.3 デバイス制御層（DeviceCtrl）との境界</w:t>
         </w:r>
       </w:hyperlink>
     </w:p>
@@ -1142,7 +1170,7 @@
             <w:rFonts w:ascii="Meiryo UI" w:eastAsia="Meiryo UI" w:hAnsi="Meiryo UI" w:cs="Meiryo UI" w:hint="eastAsia"/>
             <w:noProof/>
           </w:rPr>
-          <w:t xml:space="preserve">4 Host 内部構成</w:t>
+          <w:t xml:space="preserve">4 デバイス接続サーバー（Host）内部構成</w:t>
         </w:r>
       </w:hyperlink>
     </w:p>
@@ -1282,7 +1310,7 @@
             <w:rFonts w:ascii="Meiryo UI" w:eastAsia="Meiryo UI" w:hAnsi="Meiryo UI" w:cs="Meiryo UI" w:hint="eastAsia"/>
             <w:noProof/>
           </w:rPr>
-          <w:t xml:space="preserve">6 初期対象デバイス</w:t>
+          <w:t xml:space="preserve">6 初期対象デバイスと機種追加方針</w:t>
         </w:r>
       </w:hyperlink>
     </w:p>
@@ -1398,7 +1426,21 @@
         <w:rPr>
           <w:rFonts w:ascii="HG丸ｺﾞｼｯｸM-PRO" w:eastAsia="HG丸ｺﾞｼｯｸM-PRO" w:hAnsi="HG丸ｺﾞｼｯｸM-PRO" w:cs="HG丸ｺﾞｼｯｸM-PRO" w:hint="eastAsia"/>
         </w:rPr>
-        <w:t xml:space="preserve">対象は </w:t>
+        <w:t xml:space="preserve">対象はデバイス接続サーバー（Host）を中心とし、Host の起動、Named Pipe 通信、コマンド処理、Host 内デバイス管理、既存デバイス資源の呼び出し方式を扱う。</w:t>
+      </w:r>
+    </w:p>
+    <w:p>
+      <w:pPr>
+        <w:pStyle w:val="FXSS7"/>
+        <w:rPr>
+          <w:rFonts w:ascii="HG丸ｺﾞｼｯｸM-PRO" w:eastAsia="HG丸ｺﾞｼｯｸM-PRO" w:hAnsi="HG丸ｺﾞｼｯｸM-PRO" w:cs="HG丸ｺﾞｼｯｸM-PRO"/>
+        </w:rPr>
+      </w:pPr>
+      <w:r>
+        <w:rPr>
+          <w:rFonts w:ascii="HG丸ｺﾞｼｯｸM-PRO" w:eastAsia="HG丸ｺﾞｼｯｸM-PRO" w:hAnsi="HG丸ｺﾞｼｯｸM-PRO" w:cs="HG丸ｺﾞｼｯｸM-PRO" w:hint="eastAsia"/>
+        </w:rPr>
+        <w:t xml:space="preserve">本書では、タブレットPOSアプリ側の </w:t>
       </w:r>
       <w:r>
         <w:rPr>
@@ -1407,22 +1449,14 @@
           <w:szCs w:val="18"/>
           <w:shd w:val="clear" w:color="auto" w:fill="F0F0F0"/>
         </w:rPr>
-        <w:t xml:space="preserve">TabetPos.Host</w:t>
+        <w:t xml:space="preserve">TabetPos.DeviceCtrl</w:t>
       </w:r>
       <w:r>
         <w:rPr>
           <w:rFonts w:ascii="HG丸ｺﾞｼｯｸM-PRO" w:eastAsia="HG丸ｺﾞｼｯｸM-PRO" w:hAnsi="HG丸ｺﾞｼｯｸM-PRO" w:cs="HG丸ｺﾞｼｯｸM-PRO" w:hint="eastAsia"/>
         </w:rPr>
-        <w:t xml:space="preserve"> を中心とし、Host の起動、Named Pipe 通信、コマンド処理、Host 内デバイス管理、既存デバイス資源の呼び出し方式を扱う。</w:t>
-      </w:r>
-    </w:p>
-    <w:p>
-      <w:pPr>
-        <w:pStyle w:val="FXSS7"/>
-        <w:rPr>
-          <w:rFonts w:ascii="HG丸ｺﾞｼｯｸM-PRO" w:eastAsia="HG丸ｺﾞｼｯｸM-PRO" w:hAnsi="HG丸ｺﾞｼｯｸM-PRO" w:cs="HG丸ｺﾞｼｯｸM-PRO"/>
-        </w:rPr>
-      </w:pPr>
+        <w:t xml:space="preserve"> を「デバイス制御層（DeviceCtrl）」、</w:t>
+      </w:r>
       <w:r>
         <w:rPr>
           <w:rFonts w:ascii="Consolas" w:eastAsia="Consolas" w:hAnsi="Consolas" w:cs="Consolas"/>
@@ -1430,13 +1464,27 @@
           <w:szCs w:val="18"/>
           <w:shd w:val="clear" w:color="auto" w:fill="F0F0F0"/>
         </w:rPr>
-        <w:t xml:space="preserve">TabetPos.DeviceCtrl</w:t>
+        <w:t xml:space="preserve">TabetPos.Host</w:t>
       </w:r>
       <w:r>
         <w:rPr>
           <w:rFonts w:ascii="HG丸ｺﾞｼｯｸM-PRO" w:eastAsia="HG丸ｺﾞｼｯｸM-PRO" w:hAnsi="HG丸ｺﾞｼｯｸM-PRO" w:cs="HG丸ｺﾞｼｯｸM-PRO" w:hint="eastAsia"/>
         </w:rPr>
-        <w:t xml:space="preserve"> はタブレットPOSアプリ内のデバイス制御層であり、本書ではデバイス接続サーバーへ要求を渡す呼び出し境界として扱う。DeviceCtrl 内部の strategy / factory / interface の詳細は、本書の主対象ではない。</w:t>
+        <w:t xml:space="preserve"> を「デバイス接続サーバー（Host）」と表記する。以降は、文脈上明らかな場合は「デバイス制御層」「デバイス接続サーバー」と記載する。</w:t>
+      </w:r>
+    </w:p>
+    <w:p>
+      <w:pPr>
+        <w:pStyle w:val="FXSS7"/>
+        <w:rPr>
+          <w:rFonts w:ascii="HG丸ｺﾞｼｯｸM-PRO" w:eastAsia="HG丸ｺﾞｼｯｸM-PRO" w:hAnsi="HG丸ｺﾞｼｯｸM-PRO" w:cs="HG丸ｺﾞｼｯｸM-PRO"/>
+        </w:rPr>
+      </w:pPr>
+      <w:r>
+        <w:rPr>
+          <w:rFonts w:ascii="HG丸ｺﾞｼｯｸM-PRO" w:eastAsia="HG丸ｺﾞｼｯｸM-PRO" w:hAnsi="HG丸ｺﾞｼｯｸM-PRO" w:cs="HG丸ｺﾞｼｯｸM-PRO" w:hint="eastAsia"/>
+        </w:rPr>
+        <w:t xml:space="preserve">デバイス制御層（DeviceCtrl）は、タブレットPOSアプリ内で機器ごとの制御方式を選択し、デバイス接続サーバーへ要求を渡す呼び出し境界として扱う。デバイス制御層内の制御方式選択、生成処理、インターフェースの詳細は、本書の主対象ではない。</w:t>
       </w:r>
     </w:p>
     <w:p>
@@ -1483,7 +1531,7 @@
         <w:rPr>
           <w:rFonts w:ascii="HG丸ｺﾞｼｯｸM-PRO" w:eastAsia="HG丸ｺﾞｼｯｸM-PRO" w:hAnsi="HG丸ｺﾞｼｯｸM-PRO" w:cs="HG丸ｺﾞｼｯｸM-PRO" w:hint="eastAsia"/>
         </w:rPr>
-        <w:t xml:space="preserve">初期段階では、既存 OPOS / OCX / legacy DLL との結合が強いデバイスを Host 側に配置し、タブレットPOSアプリからは Named Pipe 経由で操作要求だけを送信する。</w:t>
+        <w:t xml:space="preserve">初期段階では、既存 OPOS / OCX / DLL との結合が強いデバイスをデバイス接続サーバー（Host）側に配置し、タブレットPOSアプリからは Named Pipe 経由で操作要求だけを送信する。</w:t>
       </w:r>
     </w:p>
     <w:p>
@@ -1530,7 +1578,7 @@
         <w:rPr>
           <w:rFonts w:ascii="HG丸ｺﾞｼｯｸM-PRO" w:eastAsia="HG丸ｺﾞｼｯｸM-PRO" w:hAnsi="HG丸ｺﾞｼｯｸM-PRO" w:cs="HG丸ｺﾞｼｯｸM-PRO" w:hint="eastAsia"/>
         </w:rPr>
-        <w:t xml:space="preserve">デバイス接続サーバーは Windows 端末上で動作する Host プロセスである。</w:t>
+        <w:t xml:space="preserve">デバイス接続サーバー（Host）は Windows 端末上で動作する別プロセスである。</w:t>
       </w:r>
     </w:p>
     <w:p>
@@ -1544,7 +1592,7 @@
         <w:rPr>
           <w:rFonts w:ascii="HG丸ｺﾞｼｯｸM-PRO" w:eastAsia="HG丸ｺﾞｼｯｸM-PRO" w:hAnsi="HG丸ｺﾞｼｯｸM-PRO" w:cs="HG丸ｺﾞｼｯｸM-PRO" w:hint="eastAsia"/>
         </w:rPr>
-        <w:t xml:space="preserve">タブレットPOSアプリは DeviceCtrl 内の </w:t>
+        <w:t xml:space="preserve">タブレットPOSアプリはデバイス制御層（DeviceCtrl）内の </w:t>
       </w:r>
       <w:r>
         <w:rPr>
@@ -1655,8 +1703,8 @@
         <w:tblLook w:val="04A0" w:firstRow="1" w:lastRow="0" w:firstColumn="1" w:lastColumn="0" w:noHBand="0" w:noVBand="1"/>
       </w:tblPr>
       <w:tblGrid>
-        <w:gridCol w:w="2409"/>
-        <w:gridCol w:w="7229"/>
+        <w:gridCol w:w="1661"/>
+        <w:gridCol w:w="7977"/>
       </w:tblGrid>
       <w:tr>
         <w:trPr>
@@ -1664,7 +1712,7 @@
         </w:trPr>
         <w:tc>
           <w:tcPr>
-            <w:tcW w:w="2409" w:type="dxa"/>
+            <w:tcW w:w="1661" w:type="dxa"/>
             <w:tcBorders>
               <w:top w:val="single" w:sz="4" w:space="0" w:color="C6C6C6"/>
               <w:left w:val="single" w:sz="4" w:space="0" w:color="C6C6C6"/>
@@ -1702,7 +1750,7 @@
         </w:tc>
         <w:tc>
           <w:tcPr>
-            <w:tcW w:w="7229" w:type="dxa"/>
+            <w:tcW w:w="7977" w:type="dxa"/>
             <w:tcBorders>
               <w:top w:val="single" w:sz="4" w:space="0" w:color="C6C6C6"/>
               <w:left w:val="single" w:sz="4" w:space="0" w:color="C6C6C6"/>
@@ -1742,7 +1790,7 @@
       <w:tr>
         <w:tc>
           <w:tcPr>
-            <w:tcW w:w="2409" w:type="dxa"/>
+            <w:tcW w:w="1661" w:type="dxa"/>
             <w:tcBorders>
               <w:top w:val="single" w:sz="4" w:space="0" w:color="C6C6C6"/>
               <w:left w:val="single" w:sz="4" w:space="0" w:color="C6C6C6"/>
@@ -1778,7 +1826,7 @@
         </w:tc>
         <w:tc>
           <w:tcPr>
-            <w:tcW w:w="7229" w:type="dxa"/>
+            <w:tcW w:w="7977" w:type="dxa"/>
             <w:tcBorders>
               <w:top w:val="single" w:sz="4" w:space="0" w:color="C6C6C6"/>
               <w:left w:val="single" w:sz="4" w:space="0" w:color="C6C6C6"/>
@@ -1808,7 +1856,7 @@
                 <w:sz w:val="18"/>
                 <w:szCs w:val="18"/>
               </w:rPr>
-              <w:t xml:space="preserve">デバイス接続サーバーの起動、通信、command 処理、デバイス管理の責務を確認する</w:t>
+              <w:t xml:space="preserve">デバイス接続サーバー（Host）の起動、通信、command 処理、デバイス管理の責務を確認する</w:t>
             </w:r>
           </w:p>
         </w:tc>
@@ -1816,7 +1864,7 @@
       <w:tr>
         <w:tc>
           <w:tcPr>
-            <w:tcW w:w="2409" w:type="dxa"/>
+            <w:tcW w:w="1661" w:type="dxa"/>
             <w:tcBorders>
               <w:top w:val="single" w:sz="4" w:space="0" w:color="C6C6C6"/>
               <w:left w:val="single" w:sz="4" w:space="0" w:color="C6C6C6"/>
@@ -1846,13 +1894,13 @@
                 <w:sz w:val="18"/>
                 <w:szCs w:val="18"/>
               </w:rPr>
-              <w:t xml:space="preserve">DeviceCtrl 開発者</w:t>
+              <w:t xml:space="preserve">デバイス制御層開発者</w:t>
             </w:r>
           </w:p>
         </w:tc>
         <w:tc>
           <w:tcPr>
-            <w:tcW w:w="7229" w:type="dxa"/>
+            <w:tcW w:w="7977" w:type="dxa"/>
             <w:tcBorders>
               <w:top w:val="single" w:sz="4" w:space="0" w:color="C6C6C6"/>
               <w:left w:val="single" w:sz="4" w:space="0" w:color="C6C6C6"/>
@@ -1882,7 +1930,7 @@
                 <w:sz w:val="18"/>
                 <w:szCs w:val="18"/>
               </w:rPr>
-              <w:t xml:space="preserve">アプリ側から Host へ渡す Named Pipe 境界を確認する</w:t>
+              <w:t xml:space="preserve">アプリ側からデバイス接続サーバー（Host）へ渡す Named Pipe 境界を確認する</w:t>
             </w:r>
           </w:p>
         </w:tc>
@@ -1890,7 +1938,7 @@
       <w:tr>
         <w:tc>
           <w:tcPr>
-            <w:tcW w:w="2409" w:type="dxa"/>
+            <w:tcW w:w="1661" w:type="dxa"/>
             <w:tcBorders>
               <w:top w:val="single" w:sz="4" w:space="0" w:color="C6C6C6"/>
               <w:left w:val="single" w:sz="4" w:space="0" w:color="C6C6C6"/>
@@ -1926,7 +1974,7 @@
         </w:tc>
         <w:tc>
           <w:tcPr>
-            <w:tcW w:w="7229" w:type="dxa"/>
+            <w:tcW w:w="7977" w:type="dxa"/>
             <w:tcBorders>
               <w:top w:val="single" w:sz="4" w:space="0" w:color="C6C6C6"/>
               <w:left w:val="single" w:sz="4" w:space="0" w:color="C6C6C6"/>
@@ -1964,7 +2012,7 @@
       <w:tr>
         <w:tc>
           <w:tcPr>
-            <w:tcW w:w="2409" w:type="dxa"/>
+            <w:tcW w:w="1661" w:type="dxa"/>
             <w:tcBorders>
               <w:top w:val="single" w:sz="4" w:space="0" w:color="C6C6C6"/>
               <w:left w:val="single" w:sz="4" w:space="0" w:color="C6C6C6"/>
@@ -2000,7 +2048,7 @@
         </w:tc>
         <w:tc>
           <w:tcPr>
-            <w:tcW w:w="7229" w:type="dxa"/>
+            <w:tcW w:w="7977" w:type="dxa"/>
             <w:tcBorders>
               <w:top w:val="single" w:sz="4" w:space="0" w:color="C6C6C6"/>
               <w:left w:val="single" w:sz="4" w:space="0" w:color="C6C6C6"/>
@@ -2740,7 +2788,7 @@
         <w:rPr>
           <w:rFonts w:ascii="HG丸ｺﾞｼｯｸM-PRO" w:eastAsia="HG丸ｺﾞｼｯｸM-PRO" w:hAnsi="HG丸ｺﾞｼｯｸM-PRO" w:cs="HG丸ｺﾞｼｯｸM-PRO" w:hint="eastAsia"/>
         </w:rPr>
-        <w:t xml:space="preserve">図 2-1 に、タブレットPOSアプリ、DeviceCtrl、デバイス接続サーバー、周辺機器の関係を示す。</w:t>
+        <w:t xml:space="preserve">図 2-1 に、タブレットPOSアプリ、デバイス制御層（DeviceCtrl）、デバイス接続サーバー（Host）、周辺機器の関係を示す。</w:t>
       </w:r>
     </w:p>
     <w:p>
@@ -2808,7 +2856,7 @@
         <w:rPr>
           <w:rFonts w:ascii="HG丸ｺﾞｼｯｸM-PRO" w:eastAsia="HG丸ｺﾞｼｯｸM-PRO" w:hAnsi="HG丸ｺﾞｼｯｸM-PRO" w:cs="HG丸ｺﾞｼｯｸM-PRO" w:hint="eastAsia"/>
         </w:rPr>
-        <w:t xml:space="preserve">図内の Host 側ブロック名は、対応するプログラム仕様書の機能名を示す。括弧内は実装 class 名を示す。</w:t>
+        <w:t xml:space="preserve">図内のデバイス接続サーバー（Host）側ブロック名は、対応するプログラム仕様書の機能名を示す。括弧内は実装 class 名を示す。</w:t>
       </w:r>
     </w:p>
     <w:p>
@@ -2846,9 +2894,9 @@
         <w:tblLook w:val="04A0" w:firstRow="1" w:lastRow="0" w:firstColumn="1" w:lastColumn="0" w:noHBand="0" w:noVBand="1"/>
       </w:tblPr>
       <w:tblGrid>
-        <w:gridCol w:w="910"/>
-        <w:gridCol w:w="5388"/>
-        <w:gridCol w:w="3340"/>
+        <w:gridCol w:w="1366"/>
+        <w:gridCol w:w="5106"/>
+        <w:gridCol w:w="3166"/>
       </w:tblGrid>
       <w:tr>
         <w:trPr>
@@ -2856,7 +2904,7 @@
         </w:trPr>
         <w:tc>
           <w:tcPr>
-            <w:tcW w:w="910" w:type="dxa"/>
+            <w:tcW w:w="1366" w:type="dxa"/>
             <w:tcBorders>
               <w:top w:val="single" w:sz="4" w:space="0" w:color="C6C6C6"/>
               <w:left w:val="single" w:sz="4" w:space="0" w:color="C6C6C6"/>
@@ -2894,7 +2942,7 @@
         </w:tc>
         <w:tc>
           <w:tcPr>
-            <w:tcW w:w="5388" w:type="dxa"/>
+            <w:tcW w:w="5106" w:type="dxa"/>
             <w:tcBorders>
               <w:top w:val="single" w:sz="4" w:space="0" w:color="C6C6C6"/>
               <w:left w:val="single" w:sz="4" w:space="0" w:color="C6C6C6"/>
@@ -2932,7 +2980,7 @@
         </w:tc>
         <w:tc>
           <w:tcPr>
-            <w:tcW w:w="3340" w:type="dxa"/>
+            <w:tcW w:w="3166" w:type="dxa"/>
             <w:tcBorders>
               <w:top w:val="single" w:sz="4" w:space="0" w:color="C6C6C6"/>
               <w:left w:val="single" w:sz="4" w:space="0" w:color="C6C6C6"/>
@@ -2972,7 +3020,7 @@
       <w:tr>
         <w:tc>
           <w:tcPr>
-            <w:tcW w:w="910" w:type="dxa"/>
+            <w:tcW w:w="1366" w:type="dxa"/>
             <w:tcBorders>
               <w:top w:val="single" w:sz="4" w:space="0" w:color="C6C6C6"/>
               <w:left w:val="single" w:sz="4" w:space="0" w:color="C6C6C6"/>
@@ -3008,7 +3056,7 @@
         </w:tc>
         <w:tc>
           <w:tcPr>
-            <w:tcW w:w="5388" w:type="dxa"/>
+            <w:tcW w:w="5106" w:type="dxa"/>
             <w:tcBorders>
               <w:top w:val="single" w:sz="4" w:space="0" w:color="C6C6C6"/>
               <w:left w:val="single" w:sz="4" w:space="0" w:color="C6C6C6"/>
@@ -3044,7 +3092,7 @@
         </w:tc>
         <w:tc>
           <w:tcPr>
-            <w:tcW w:w="3340" w:type="dxa"/>
+            <w:tcW w:w="3166" w:type="dxa"/>
             <w:tcBorders>
               <w:top w:val="single" w:sz="4" w:space="0" w:color="C6C6C6"/>
               <w:left w:val="single" w:sz="4" w:space="0" w:color="C6C6C6"/>
@@ -3082,7 +3130,7 @@
       <w:tr>
         <w:tc>
           <w:tcPr>
-            <w:tcW w:w="910" w:type="dxa"/>
+            <w:tcW w:w="1366" w:type="dxa"/>
             <w:tcBorders>
               <w:top w:val="single" w:sz="4" w:space="0" w:color="C6C6C6"/>
               <w:left w:val="single" w:sz="4" w:space="0" w:color="C6C6C6"/>
@@ -3112,13 +3160,13 @@
                 <w:sz w:val="18"/>
                 <w:szCs w:val="18"/>
               </w:rPr>
-              <w:t xml:space="preserve">デバイス制御層</w:t>
+              <w:t xml:space="preserve">デバイス制御層（DeviceCtrl）</w:t>
             </w:r>
           </w:p>
         </w:tc>
         <w:tc>
           <w:tcPr>
-            <w:tcW w:w="5388" w:type="dxa"/>
+            <w:tcW w:w="5106" w:type="dxa"/>
             <w:tcBorders>
               <w:top w:val="single" w:sz="4" w:space="0" w:color="C6C6C6"/>
               <w:left w:val="single" w:sz="4" w:space="0" w:color="C6C6C6"/>
@@ -3189,7 +3237,7 @@
         </w:tc>
         <w:tc>
           <w:tcPr>
-            <w:tcW w:w="3340" w:type="dxa"/>
+            <w:tcW w:w="3166" w:type="dxa"/>
             <w:tcBorders>
               <w:top w:val="single" w:sz="4" w:space="0" w:color="C6C6C6"/>
               <w:left w:val="single" w:sz="4" w:space="0" w:color="C6C6C6"/>
@@ -3227,7 +3275,7 @@
       <w:tr>
         <w:tc>
           <w:tcPr>
-            <w:tcW w:w="910" w:type="dxa"/>
+            <w:tcW w:w="1366" w:type="dxa"/>
             <w:tcBorders>
               <w:top w:val="single" w:sz="4" w:space="0" w:color="C6C6C6"/>
               <w:left w:val="single" w:sz="4" w:space="0" w:color="C6C6C6"/>
@@ -3257,13 +3305,13 @@
                 <w:sz w:val="18"/>
                 <w:szCs w:val="18"/>
               </w:rPr>
-              <w:t xml:space="preserve">デバイス接続サーバー</w:t>
+              <w:t xml:space="preserve">デバイス接続サーバー（Host）</w:t>
             </w:r>
           </w:p>
         </w:tc>
         <w:tc>
           <w:tcPr>
-            <w:tcW w:w="5388" w:type="dxa"/>
+            <w:tcW w:w="5106" w:type="dxa"/>
             <w:tcBorders>
               <w:top w:val="single" w:sz="4" w:space="0" w:color="C6C6C6"/>
               <w:left w:val="single" w:sz="4" w:space="0" w:color="C6C6C6"/>
@@ -3317,7 +3365,7 @@
         </w:tc>
         <w:tc>
           <w:tcPr>
-            <w:tcW w:w="3340" w:type="dxa"/>
+            <w:tcW w:w="3166" w:type="dxa"/>
             <w:tcBorders>
               <w:top w:val="single" w:sz="4" w:space="0" w:color="C6C6C6"/>
               <w:left w:val="single" w:sz="4" w:space="0" w:color="C6C6C6"/>
@@ -3355,7 +3403,7 @@
       <w:tr>
         <w:tc>
           <w:tcPr>
-            <w:tcW w:w="910" w:type="dxa"/>
+            <w:tcW w:w="1366" w:type="dxa"/>
             <w:tcBorders>
               <w:top w:val="single" w:sz="4" w:space="0" w:color="C6C6C6"/>
               <w:left w:val="single" w:sz="4" w:space="0" w:color="C6C6C6"/>
@@ -3391,7 +3439,7 @@
         </w:tc>
         <w:tc>
           <w:tcPr>
-            <w:tcW w:w="5388" w:type="dxa"/>
+            <w:tcW w:w="5106" w:type="dxa"/>
             <w:tcBorders>
               <w:top w:val="single" w:sz="4" w:space="0" w:color="C6C6C6"/>
               <w:left w:val="single" w:sz="4" w:space="0" w:color="C6C6C6"/>
@@ -3462,7 +3510,7 @@
         </w:tc>
         <w:tc>
           <w:tcPr>
-            <w:tcW w:w="3340" w:type="dxa"/>
+            <w:tcW w:w="3166" w:type="dxa"/>
             <w:tcBorders>
               <w:top w:val="single" w:sz="4" w:space="0" w:color="C6C6C6"/>
               <w:left w:val="single" w:sz="4" w:space="0" w:color="C6C6C6"/>
@@ -3500,7 +3548,7 @@
       <w:tr>
         <w:tc>
           <w:tcPr>
-            <w:tcW w:w="910" w:type="dxa"/>
+            <w:tcW w:w="1366" w:type="dxa"/>
             <w:tcBorders>
               <w:top w:val="single" w:sz="4" w:space="0" w:color="C6C6C6"/>
               <w:left w:val="single" w:sz="4" w:space="0" w:color="C6C6C6"/>
@@ -3536,7 +3584,7 @@
         </w:tc>
         <w:tc>
           <w:tcPr>
-            <w:tcW w:w="5388" w:type="dxa"/>
+            <w:tcW w:w="5106" w:type="dxa"/>
             <w:tcBorders>
               <w:top w:val="single" w:sz="4" w:space="0" w:color="C6C6C6"/>
               <w:left w:val="single" w:sz="4" w:space="0" w:color="C6C6C6"/>
@@ -3598,7 +3646,7 @@
         </w:tc>
         <w:tc>
           <w:tcPr>
-            <w:tcW w:w="3340" w:type="dxa"/>
+            <w:tcW w:w="3166" w:type="dxa"/>
             <w:tcBorders>
               <w:top w:val="single" w:sz="4" w:space="0" w:color="C6C6C6"/>
               <w:left w:val="single" w:sz="4" w:space="0" w:color="C6C6C6"/>
@@ -3628,7 +3676,7 @@
                 <w:sz w:val="18"/>
                 <w:szCs w:val="18"/>
               </w:rPr>
-              <w:t xml:space="preserve">既存 OPOS / OCX / legacy DLL を利用して実機を制御する</w:t>
+              <w:t xml:space="preserve">既存 OPOS / OCX / DLL を利用して実機を制御する</w:t>
             </w:r>
           </w:p>
         </w:tc>
@@ -3636,7 +3684,7 @@
       <w:tr>
         <w:tc>
           <w:tcPr>
-            <w:tcW w:w="910" w:type="dxa"/>
+            <w:tcW w:w="1366" w:type="dxa"/>
             <w:tcBorders>
               <w:top w:val="single" w:sz="4" w:space="0" w:color="C6C6C6"/>
               <w:left w:val="single" w:sz="4" w:space="0" w:color="C6C6C6"/>
@@ -3672,7 +3720,7 @@
         </w:tc>
         <w:tc>
           <w:tcPr>
-            <w:tcW w:w="5388" w:type="dxa"/>
+            <w:tcW w:w="5106" w:type="dxa"/>
             <w:tcBorders>
               <w:top w:val="single" w:sz="4" w:space="0" w:color="C6C6C6"/>
               <w:left w:val="single" w:sz="4" w:space="0" w:color="C6C6C6"/>
@@ -3708,7 +3756,7 @@
         </w:tc>
         <w:tc>
           <w:tcPr>
-            <w:tcW w:w="3340" w:type="dxa"/>
+            <w:tcW w:w="3166" w:type="dxa"/>
             <w:tcBorders>
               <w:top w:val="single" w:sz="4" w:space="0" w:color="C6C6C6"/>
               <w:left w:val="single" w:sz="4" w:space="0" w:color="C6C6C6"/>
@@ -3755,6 +3803,20 @@
     </w:p>
     <w:p>
       <w:pPr>
+        <w:pStyle w:val="FXSS7"/>
+        <w:rPr>
+          <w:rFonts w:ascii="HG丸ｺﾞｼｯｸM-PRO" w:eastAsia="HG丸ｺﾞｼｯｸM-PRO" w:hAnsi="HG丸ｺﾞｼｯｸM-PRO" w:cs="HG丸ｺﾞｼｯｸM-PRO"/>
+        </w:rPr>
+      </w:pPr>
+      <w:r>
+        <w:rPr>
+          <w:rFonts w:ascii="HG丸ｺﾞｼｯｸM-PRO" w:eastAsia="HG丸ｺﾞｼｯｸM-PRO" w:hAnsi="HG丸ｺﾞｼｯｸM-PRO" w:cs="HG丸ｺﾞｼｯｸM-PRO" w:hint="eastAsia"/>
+        </w:rPr>
+        <w:t xml:space="preserve">デバイス制御層（DeviceCtrl）は、タブレットPOSアプリ側で制御方式を選択する部品である。一方、デバイス接続サーバー（Host）側の部品は、既存デバイス資源を呼び出すための内部実装である。両者は同じ役割の部品として扱わない。</w:t>
+      </w:r>
+    </w:p>
+    <w:p>
+      <w:pPr>
         <w:pStyle w:val="FXSS20"/>
         <w:numPr>
           <w:numId w:val="0"/>
@@ -3768,7 +3830,7 @@
         <w:rPr>
           <w:rFonts w:ascii="HG丸ｺﾞｼｯｸM-PRO" w:eastAsia="HG丸ｺﾞｼｯｸM-PRO" w:hAnsi="HG丸ｺﾞｼｯｸM-PRO" w:cs="HG丸ｺﾞｼｯｸM-PRO" w:hint="eastAsia"/>
         </w:rPr>
-        <w:t xml:space="preserve">2.3  DeviceCtrl との境界</w:t>
+        <w:t xml:space="preserve">2.3  デバイス制御層（DeviceCtrl）との境界</w:t>
       </w:r>
       <w:bookmarkEnd w:id="110"/>
     </w:p>
@@ -3783,7 +3845,7 @@
         <w:rPr>
           <w:rFonts w:ascii="HG丸ｺﾞｼｯｸM-PRO" w:eastAsia="HG丸ｺﾞｼｯｸM-PRO" w:hAnsi="HG丸ｺﾞｼｯｸM-PRO" w:cs="HG丸ｺﾞｼｯｸM-PRO" w:hint="eastAsia"/>
         </w:rPr>
-        <w:t xml:space="preserve">DeviceCtrl はタブレットPOSアプリ内の layer であり、デバイス接続サーバーとは別プロセスの Host へ要求を渡す。</w:t>
+        <w:t xml:space="preserve">デバイス制御層（DeviceCtrl）はタブレットPOSアプリ内の層であり、デバイス接続サーバーとは別プロセスの Host へ要求を渡す。</w:t>
       </w:r>
     </w:p>
     <w:p>
@@ -3797,7 +3859,7 @@
         <w:rPr>
           <w:rFonts w:ascii="HG丸ｺﾞｼｯｸM-PRO" w:eastAsia="HG丸ｺﾞｼｯｸM-PRO" w:hAnsi="HG丸ｺﾞｼｯｸM-PRO" w:cs="HG丸ｺﾞｼｯｸM-PRO" w:hint="eastAsia"/>
         </w:rPr>
-        <w:t xml:space="preserve">DeviceCtrl は </w:t>
+        <w:t xml:space="preserve">デバイス制御層は </w:t>
       </w:r>
       <w:r>
         <w:rPr>
@@ -3861,6 +3923,25 @@
     </w:p>
     <w:p>
       <w:pPr>
+        <w:pStyle w:val="FXSS20"/>
+        <w:numPr>
+          <w:numId w:val="0"/>
+        </w:numPr>
+        <w:rPr>
+          <w:rFonts w:ascii="HG丸ｺﾞｼｯｸM-PRO" w:eastAsia="HG丸ｺﾞｼｯｸM-PRO" w:hAnsi="HG丸ｺﾞｼｯｸM-PRO" w:cs="HG丸ｺﾞｼｯｸM-PRO"/>
+        </w:rPr>
+      </w:pPr>
+      <w:bookmarkStart w:id="111" w:name="_TOC111"/>
+      <w:r>
+        <w:rPr>
+          <w:rFonts w:ascii="HG丸ｺﾞｼｯｸM-PRO" w:eastAsia="HG丸ｺﾞｼｯｸM-PRO" w:hAnsi="HG丸ｺﾞｼｯｸM-PRO" w:cs="HG丸ｺﾞｼｯｸM-PRO" w:hint="eastAsia"/>
+        </w:rPr>
+        <w:t xml:space="preserve">2.4  デバイス接続サーバーの責務</w:t>
+      </w:r>
+      <w:bookmarkEnd w:id="111"/>
+    </w:p>
+    <w:p>
+      <w:pPr>
         <w:pStyle w:val="FXSS7"/>
         <w:rPr>
           <w:rFonts w:ascii="HG丸ｺﾞｼｯｸM-PRO" w:eastAsia="HG丸ｺﾞｼｯｸM-PRO" w:hAnsi="HG丸ｺﾞｼｯｸM-PRO" w:cs="HG丸ｺﾞｼｯｸM-PRO"/>
@@ -3870,7 +3951,21 @@
         <w:rPr>
           <w:rFonts w:ascii="HG丸ｺﾞｼｯｸM-PRO" w:eastAsia="HG丸ｺﾞｼｯｸM-PRO" w:hAnsi="HG丸ｺﾞｼｯｸM-PRO" w:cs="HG丸ｺﾞｼｯｸM-PRO" w:hint="eastAsia"/>
         </w:rPr>
-        <w:t xml:space="preserve">旧方式の </w:t>
+        <w:t xml:space="preserve">デバイス接続サーバー（Host）は、アプリケーションから分離したプロセスとして、既存デバイス資源の起動、保持、呼び出し、終了を担当する。</w:t>
+      </w:r>
+    </w:p>
+    <w:p>
+      <w:pPr>
+        <w:pStyle w:val="FXSS7"/>
+        <w:rPr>
+          <w:rFonts w:ascii="HG丸ｺﾞｼｯｸM-PRO" w:eastAsia="HG丸ｺﾞｼｯｸM-PRO" w:hAnsi="HG丸ｺﾞｼｯｸM-PRO" w:cs="HG丸ｺﾞｼｯｸM-PRO"/>
+        </w:rPr>
+      </w:pPr>
+      <w:r>
+        <w:rPr>
+          <w:rFonts w:ascii="HG丸ｺﾞｼｯｸM-PRO" w:eastAsia="HG丸ｺﾞｼｯｸM-PRO" w:hAnsi="HG丸ｺﾞｼｯｸM-PRO" w:cs="HG丸ｺﾞｼｯｸM-PRO" w:hint="eastAsia"/>
+        </w:rPr>
+        <w:t xml:space="preserve">Host 側では </w:t>
       </w:r>
       <w:r>
         <w:rPr>
@@ -3879,60 +3974,13 @@
           <w:szCs w:val="18"/>
           <w:shd w:val="clear" w:color="auto" w:fill="F0F0F0"/>
         </w:rPr>
-        <w:t xml:space="preserve">KsClient</w:t>
+        <w:t xml:space="preserve">TabletHost</w:t>
       </w:r>
       <w:r>
         <w:rPr>
           <w:rFonts w:ascii="HG丸ｺﾞｼｯｸM-PRO" w:eastAsia="HG丸ｺﾞｼｯｸM-PRO" w:hAnsi="HG丸ｺﾞｼｯｸM-PRO" w:cs="HG丸ｺﾞｼｯｸM-PRO" w:hint="eastAsia"/>
         </w:rPr>
-        <w:t xml:space="preserve"> による DLL 連携は、旧 Tablet POS へ Device Connect App の DLL SDK を組み込むための方式である。現行方式では Named Pipe を使用するため、この経路は使用しない。</w:t>
-      </w:r>
-    </w:p>
-    <w:p>
-      <w:pPr>
-        <w:pStyle w:val="FXSS20"/>
-        <w:numPr>
-          <w:numId w:val="0"/>
-        </w:numPr>
-        <w:rPr>
-          <w:rFonts w:ascii="HG丸ｺﾞｼｯｸM-PRO" w:eastAsia="HG丸ｺﾞｼｯｸM-PRO" w:hAnsi="HG丸ｺﾞｼｯｸM-PRO" w:cs="HG丸ｺﾞｼｯｸM-PRO"/>
-        </w:rPr>
-      </w:pPr>
-      <w:bookmarkStart w:id="111" w:name="_TOC111"/>
-      <w:r>
-        <w:rPr>
-          <w:rFonts w:ascii="HG丸ｺﾞｼｯｸM-PRO" w:eastAsia="HG丸ｺﾞｼｯｸM-PRO" w:hAnsi="HG丸ｺﾞｼｯｸM-PRO" w:cs="HG丸ｺﾞｼｯｸM-PRO" w:hint="eastAsia"/>
-        </w:rPr>
-        <w:t xml:space="preserve">2.4  デバイス接続サーバーの責務</w:t>
-      </w:r>
-      <w:bookmarkEnd w:id="111"/>
-    </w:p>
-    <w:p>
-      <w:pPr>
-        <w:pStyle w:val="FXSS7"/>
-        <w:rPr>
-          <w:rFonts w:ascii="HG丸ｺﾞｼｯｸM-PRO" w:eastAsia="HG丸ｺﾞｼｯｸM-PRO" w:hAnsi="HG丸ｺﾞｼｯｸM-PRO" w:cs="HG丸ｺﾞｼｯｸM-PRO"/>
-        </w:rPr>
-      </w:pPr>
-      <w:r>
-        <w:rPr>
-          <w:rFonts w:ascii="HG丸ｺﾞｼｯｸM-PRO" w:eastAsia="HG丸ｺﾞｼｯｸM-PRO" w:hAnsi="HG丸ｺﾞｼｯｸM-PRO" w:cs="HG丸ｺﾞｼｯｸM-PRO" w:hint="eastAsia"/>
-        </w:rPr>
-        <w:t xml:space="preserve">デバイス接続サーバーは、アプリケーションから分離した Host プロセスとして、既存デバイス資源の起動、保持、呼び出し、終了を担当する。</w:t>
-      </w:r>
-    </w:p>
-    <w:p>
-      <w:pPr>
-        <w:pStyle w:val="FXSS7"/>
-        <w:rPr>
-          <w:rFonts w:ascii="HG丸ｺﾞｼｯｸM-PRO" w:eastAsia="HG丸ｺﾞｼｯｸM-PRO" w:hAnsi="HG丸ｺﾞｼｯｸM-PRO" w:cs="HG丸ｺﾞｼｯｸM-PRO"/>
-        </w:rPr>
-      </w:pPr>
-      <w:r>
-        <w:rPr>
-          <w:rFonts w:ascii="HG丸ｺﾞｼｯｸM-PRO" w:eastAsia="HG丸ｺﾞｼｯｸM-PRO" w:hAnsi="HG丸ｺﾞｼｯｸM-PRO" w:cs="HG丸ｺﾞｼｯｸM-PRO" w:hint="eastAsia"/>
-        </w:rPr>
-        <w:t xml:space="preserve">Host 側では </w:t>
+        <w:t xml:space="preserve"> が </w:t>
       </w:r>
       <w:r>
         <w:rPr>
@@ -3941,13 +3989,13 @@
           <w:szCs w:val="18"/>
           <w:shd w:val="clear" w:color="auto" w:fill="F0F0F0"/>
         </w:rPr>
-        <w:t xml:space="preserve">TabletHost</w:t>
+        <w:t xml:space="preserve">TabletDeviceManager</w:t>
       </w:r>
       <w:r>
         <w:rPr>
           <w:rFonts w:ascii="HG丸ｺﾞｼｯｸM-PRO" w:eastAsia="HG丸ｺﾞｼｯｸM-PRO" w:hAnsi="HG丸ｺﾞｼｯｸM-PRO" w:cs="HG丸ｺﾞｼｯｸM-PRO" w:hint="eastAsia"/>
         </w:rPr>
-        <w:t xml:space="preserve"> が </w:t>
+        <w:t xml:space="preserve"> を起動し、</w:t>
       </w:r>
       <w:r>
         <w:rPr>
@@ -3956,13 +4004,27 @@
           <w:szCs w:val="18"/>
           <w:shd w:val="clear" w:color="auto" w:fill="F0F0F0"/>
         </w:rPr>
-        <w:t xml:space="preserve">TabletDeviceManager</w:t>
+        <w:t xml:space="preserve">host_device_config.json</w:t>
       </w:r>
       <w:r>
         <w:rPr>
           <w:rFonts w:ascii="HG丸ｺﾞｼｯｸM-PRO" w:eastAsia="HG丸ｺﾞｼｯｸM-PRO" w:hAnsi="HG丸ｺﾞｼｯｸM-PRO" w:cs="HG丸ｺﾞｼｯｸM-PRO" w:hint="eastAsia"/>
         </w:rPr>
-        <w:t xml:space="preserve"> を起動し、</w:t>
+        <w:t xml:space="preserve"> から対象デバイスを読み込む。</w:t>
+      </w:r>
+    </w:p>
+    <w:p>
+      <w:pPr>
+        <w:pStyle w:val="FXSS7"/>
+        <w:rPr>
+          <w:rFonts w:ascii="HG丸ｺﾞｼｯｸM-PRO" w:eastAsia="HG丸ｺﾞｼｯｸM-PRO" w:hAnsi="HG丸ｺﾞｼｯｸM-PRO" w:cs="HG丸ｺﾞｼｯｸM-PRO"/>
+        </w:rPr>
+      </w:pPr>
+      <w:r>
+        <w:rPr>
+          <w:rFonts w:ascii="HG丸ｺﾞｼｯｸM-PRO" w:eastAsia="HG丸ｺﾞｼｯｸM-PRO" w:hAnsi="HG丸ｺﾞｼｯｸM-PRO" w:cs="HG丸ｺﾞｼｯｸM-PRO" w:hint="eastAsia"/>
+        </w:rPr>
+        <w:t xml:space="preserve">各デバイス class は </w:t>
       </w:r>
       <w:r>
         <w:rPr>
@@ -3971,27 +4033,13 @@
           <w:szCs w:val="18"/>
           <w:shd w:val="clear" w:color="auto" w:fill="F0F0F0"/>
         </w:rPr>
-        <w:t xml:space="preserve">host_device_config.json</w:t>
+        <w:t xml:space="preserve">IFDevice</w:t>
       </w:r>
       <w:r>
         <w:rPr>
           <w:rFonts w:ascii="HG丸ｺﾞｼｯｸM-PRO" w:eastAsia="HG丸ｺﾞｼｯｸM-PRO" w:hAnsi="HG丸ｺﾞｼｯｸM-PRO" w:cs="HG丸ｺﾞｼｯｸM-PRO" w:hint="eastAsia"/>
         </w:rPr>
-        <w:t xml:space="preserve"> から対象デバイスを読み込む。</w:t>
-      </w:r>
-    </w:p>
-    <w:p>
-      <w:pPr>
-        <w:pStyle w:val="FXSS7"/>
-        <w:rPr>
-          <w:rFonts w:ascii="HG丸ｺﾞｼｯｸM-PRO" w:eastAsia="HG丸ｺﾞｼｯｸM-PRO" w:hAnsi="HG丸ｺﾞｼｯｸM-PRO" w:cs="HG丸ｺﾞｼｯｸM-PRO"/>
-        </w:rPr>
-      </w:pPr>
-      <w:r>
-        <w:rPr>
-          <w:rFonts w:ascii="HG丸ｺﾞｼｯｸM-PRO" w:eastAsia="HG丸ｺﾞｼｯｸM-PRO" w:hAnsi="HG丸ｺﾞｼｯｸM-PRO" w:cs="HG丸ｺﾞｼｯｸM-PRO" w:hint="eastAsia"/>
-        </w:rPr>
-        <w:t xml:space="preserve">各デバイス class は </w:t>
+        <w:t xml:space="preserve"> として管理され、</w:t>
       </w:r>
       <w:r>
         <w:rPr>
@@ -4000,13 +4048,13 @@
           <w:szCs w:val="18"/>
           <w:shd w:val="clear" w:color="auto" w:fill="F0F0F0"/>
         </w:rPr>
-        <w:t xml:space="preserve">IFDevice</w:t>
+        <w:t xml:space="preserve">DeviceUse</w:t>
       </w:r>
       <w:r>
         <w:rPr>
           <w:rFonts w:ascii="HG丸ｺﾞｼｯｸM-PRO" w:eastAsia="HG丸ｺﾞｼｯｸM-PRO" w:hAnsi="HG丸ｺﾞｼｯｸM-PRO" w:cs="HG丸ｺﾞｼｯｸM-PRO" w:hint="eastAsia"/>
         </w:rPr>
-        <w:t xml:space="preserve"> として管理され、</w:t>
+        <w:t xml:space="preserve">、</w:t>
       </w:r>
       <w:r>
         <w:rPr>
@@ -4015,7 +4063,7 @@
           <w:szCs w:val="18"/>
           <w:shd w:val="clear" w:color="auto" w:fill="F0F0F0"/>
         </w:rPr>
-        <w:t xml:space="preserve">DeviceUse</w:t>
+        <w:t xml:space="preserve">DeviceUnUse</w:t>
       </w:r>
       <w:r>
         <w:rPr>
@@ -4030,28 +4078,27 @@
           <w:szCs w:val="18"/>
           <w:shd w:val="clear" w:color="auto" w:fill="F0F0F0"/>
         </w:rPr>
-        <w:t xml:space="preserve">DeviceUnUse</w:t>
+        <w:t xml:space="preserve">DeviceMethod</w:t>
       </w:r>
       <w:r>
         <w:rPr>
           <w:rFonts w:ascii="HG丸ｺﾞｼｯｸM-PRO" w:eastAsia="HG丸ｺﾞｼｯｸM-PRO" w:hAnsi="HG丸ｺﾞｼｯｸM-PRO" w:cs="HG丸ｺﾞｼｯｸM-PRO" w:hint="eastAsia"/>
         </w:rPr>
-        <w:t xml:space="preserve">、</w:t>
-      </w:r>
-      <w:r>
-        <w:rPr>
-          <w:rFonts w:ascii="Consolas" w:eastAsia="Consolas" w:hAnsi="Consolas" w:cs="Consolas"/>
-          <w:sz w:val="18"/>
-          <w:szCs w:val="18"/>
-          <w:shd w:val="clear" w:color="auto" w:fill="F0F0F0"/>
-        </w:rPr>
-        <w:t xml:space="preserve">DeviceMethod</w:t>
-      </w:r>
+        <w:t xml:space="preserve"> の要求に応じて実機操作を行う。</w:t>
+      </w:r>
+    </w:p>
+    <w:p>
+      <w:pPr>
+        <w:pStyle w:val="FXSS7"/>
+        <w:rPr>
+          <w:rFonts w:ascii="HG丸ｺﾞｼｯｸM-PRO" w:eastAsia="HG丸ｺﾞｼｯｸM-PRO" w:hAnsi="HG丸ｺﾞｼｯｸM-PRO" w:cs="HG丸ｺﾞｼｯｸM-PRO"/>
+        </w:rPr>
+      </w:pPr>
       <w:r>
         <w:rPr>
           <w:rFonts w:ascii="HG丸ｺﾞｼｯｸM-PRO" w:eastAsia="HG丸ｺﾞｼｯｸM-PRO" w:hAnsi="HG丸ｺﾞｼｯｸM-PRO" w:cs="HG丸ｺﾞｼｯｸM-PRO" w:hint="eastAsia"/>
         </w:rPr>
-        <w:t xml:space="preserve"> の要求に応じて実機操作を行う。</w:t>
+        <w:t xml:space="preserve">通常運用時は、タブレットPOSアプリのライフサイクルに合わせてデバイス接続サーバー（Host）を自動起動し、ユーザーによる Start 操作は不要とする。Start/Stop 画面を残す場合も、デバッグ／開発者向けの用途に限定し、通常運用時には表示しない。</w:t>
       </w:r>
     </w:p>
     <w:p>
@@ -4161,9 +4208,9 @@
         <w:tblLook w:val="04A0" w:firstRow="1" w:lastRow="0" w:firstColumn="1" w:lastColumn="0" w:noHBand="0" w:noVBand="1"/>
       </w:tblPr>
       <w:tblGrid>
-        <w:gridCol w:w="1542"/>
-        <w:gridCol w:w="2955"/>
-        <w:gridCol w:w="5141"/>
+        <w:gridCol w:w="1427"/>
+        <w:gridCol w:w="2736"/>
+        <w:gridCol w:w="5475"/>
       </w:tblGrid>
       <w:tr>
         <w:trPr>
@@ -4171,7 +4218,7 @@
         </w:trPr>
         <w:tc>
           <w:tcPr>
-            <w:tcW w:w="1542" w:type="dxa"/>
+            <w:tcW w:w="1427" w:type="dxa"/>
             <w:tcBorders>
               <w:top w:val="single" w:sz="4" w:space="0" w:color="C6C6C6"/>
               <w:left w:val="single" w:sz="4" w:space="0" w:color="C6C6C6"/>
@@ -4209,7 +4256,7 @@
         </w:tc>
         <w:tc>
           <w:tcPr>
-            <w:tcW w:w="2955" w:type="dxa"/>
+            <w:tcW w:w="2736" w:type="dxa"/>
             <w:tcBorders>
               <w:top w:val="single" w:sz="4" w:space="0" w:color="C6C6C6"/>
               <w:left w:val="single" w:sz="4" w:space="0" w:color="C6C6C6"/>
@@ -4247,7 +4294,7 @@
         </w:tc>
         <w:tc>
           <w:tcPr>
-            <w:tcW w:w="5141" w:type="dxa"/>
+            <w:tcW w:w="5475" w:type="dxa"/>
             <w:tcBorders>
               <w:top w:val="single" w:sz="4" w:space="0" w:color="C6C6C6"/>
               <w:left w:val="single" w:sz="4" w:space="0" w:color="C6C6C6"/>
@@ -4287,7 +4334,7 @@
       <w:tr>
         <w:tc>
           <w:tcPr>
-            <w:tcW w:w="1542" w:type="dxa"/>
+            <w:tcW w:w="1427" w:type="dxa"/>
             <w:tcBorders>
               <w:top w:val="single" w:sz="4" w:space="0" w:color="C6C6C6"/>
               <w:left w:val="single" w:sz="4" w:space="0" w:color="C6C6C6"/>
@@ -4323,7 +4370,7 @@
         </w:tc>
         <w:tc>
           <w:tcPr>
-            <w:tcW w:w="2955" w:type="dxa"/>
+            <w:tcW w:w="2736" w:type="dxa"/>
             <w:tcBorders>
               <w:top w:val="single" w:sz="4" w:space="0" w:color="C6C6C6"/>
               <w:left w:val="single" w:sz="4" w:space="0" w:color="C6C6C6"/>
@@ -4360,7 +4407,7 @@
         </w:tc>
         <w:tc>
           <w:tcPr>
-            <w:tcW w:w="5141" w:type="dxa"/>
+            <w:tcW w:w="5475" w:type="dxa"/>
             <w:tcBorders>
               <w:top w:val="single" w:sz="4" w:space="0" w:color="C6C6C6"/>
               <w:left w:val="single" w:sz="4" w:space="0" w:color="C6C6C6"/>
@@ -4390,7 +4437,7 @@
                 <w:sz w:val="18"/>
                 <w:szCs w:val="18"/>
               </w:rPr>
-              <w:t xml:space="preserve">DeviceCtrl などの client から Host へ操作要求を送信する</w:t>
+              <w:t xml:space="preserve">デバイス制御層（DeviceCtrl）などのクライアントから Host へ操作要求を送信する</w:t>
             </w:r>
           </w:p>
         </w:tc>
@@ -4398,7 +4445,7 @@
       <w:tr>
         <w:tc>
           <w:tcPr>
-            <w:tcW w:w="1542" w:type="dxa"/>
+            <w:tcW w:w="1427" w:type="dxa"/>
             <w:tcBorders>
               <w:top w:val="single" w:sz="4" w:space="0" w:color="C6C6C6"/>
               <w:left w:val="single" w:sz="4" w:space="0" w:color="C6C6C6"/>
@@ -4434,7 +4481,7 @@
         </w:tc>
         <w:tc>
           <w:tcPr>
-            <w:tcW w:w="2955" w:type="dxa"/>
+            <w:tcW w:w="2736" w:type="dxa"/>
             <w:tcBorders>
               <w:top w:val="single" w:sz="4" w:space="0" w:color="C6C6C6"/>
               <w:left w:val="single" w:sz="4" w:space="0" w:color="C6C6C6"/>
@@ -4471,7 +4518,7 @@
         </w:tc>
         <w:tc>
           <w:tcPr>
-            <w:tcW w:w="5141" w:type="dxa"/>
+            <w:tcW w:w="5475" w:type="dxa"/>
             <w:tcBorders>
               <w:top w:val="single" w:sz="4" w:space="0" w:color="C6C6C6"/>
               <w:left w:val="single" w:sz="4" w:space="0" w:color="C6C6C6"/>
@@ -4527,7 +4574,7 @@
         <w:rPr>
           <w:rFonts w:ascii="HG丸ｺﾞｼｯｸM-PRO" w:eastAsia="HG丸ｺﾞｼｯｸM-PRO" w:hAnsi="HG丸ｺﾞｼｯｸM-PRO" w:cs="HG丸ｺﾞｼｯｸM-PRO" w:hint="eastAsia"/>
         </w:rPr>
-        <w:t xml:space="preserve">DeviceCtrl 側では legacy pipe 名 </w:t>
+        <w:t xml:space="preserve">デバイス制御層（DeviceCtrl）側では、Host 経由のデバイスに対して </w:t>
       </w:r>
       <w:r>
         <w:rPr>
@@ -4536,28 +4583,13 @@
           <w:szCs w:val="18"/>
           <w:shd w:val="clear" w:color="auto" w:fill="F0F0F0"/>
         </w:rPr>
-        <w:t xml:space="preserve">TabletPOSPipeMessage</w:t>
+        <w:t xml:space="preserve">TabetPos.Host.Command</w:t>
       </w:r>
       <w:r>
         <w:rPr>
           <w:rFonts w:ascii="HG丸ｺﾞｼｯｸM-PRO" w:eastAsia="HG丸ｺﾞｼｯｸM-PRO" w:hAnsi="HG丸ｺﾞｼｯｸM-PRO" w:cs="HG丸ｺﾞｼｯｸM-PRO" w:hint="eastAsia"/>
         </w:rPr>
-        <w:t xml:space="preserve"> が設定された場合でも、現行 pipe 名 </w:t>
-      </w:r>
-      <w:r>
-        <w:rPr>
-          <w:rFonts w:ascii="Consolas" w:eastAsia="Consolas" w:hAnsi="Consolas" w:cs="Consolas"/>
-          <w:sz w:val="18"/>
-          <w:szCs w:val="18"/>
-          <w:shd w:val="clear" w:color="auto" w:fill="F0F0F0"/>
-        </w:rPr>
-        <w:t xml:space="preserve">TabetPos.Host.Command</w:t>
-      </w:r>
-      <w:r>
-        <w:rPr>
-          <w:rFonts w:ascii="HG丸ｺﾞｼｯｸM-PRO" w:eastAsia="HG丸ｺﾞｼｯｸM-PRO" w:hAnsi="HG丸ｺﾞｼｯｸM-PRO" w:cs="HG丸ｺﾞｼｯｸM-PRO" w:hint="eastAsia"/>
-        </w:rPr>
-        <w:t xml:space="preserve"> に補正する。</w:t>
+        <w:t xml:space="preserve"> を使用する。</w:t>
       </w:r>
     </w:p>
     <w:p>
@@ -4596,8 +4628,8 @@
       </w:tblPr>
       <w:tblGrid>
         <w:gridCol w:w="760"/>
-        <w:gridCol w:w="4371"/>
-        <w:gridCol w:w="4507"/>
+        <w:gridCol w:w="4504"/>
+        <w:gridCol w:w="4374"/>
       </w:tblGrid>
       <w:tr>
         <w:trPr>
@@ -4643,7 +4675,7 @@
         </w:tc>
         <w:tc>
           <w:tcPr>
-            <w:tcW w:w="4371" w:type="dxa"/>
+            <w:tcW w:w="4504" w:type="dxa"/>
             <w:tcBorders>
               <w:top w:val="single" w:sz="4" w:space="0" w:color="C6C6C6"/>
               <w:left w:val="single" w:sz="4" w:space="0" w:color="C6C6C6"/>
@@ -4681,7 +4713,7 @@
         </w:tc>
         <w:tc>
           <w:tcPr>
-            <w:tcW w:w="4507" w:type="dxa"/>
+            <w:tcW w:w="4374" w:type="dxa"/>
             <w:tcBorders>
               <w:top w:val="single" w:sz="4" w:space="0" w:color="C6C6C6"/>
               <w:left w:val="single" w:sz="4" w:space="0" w:color="C6C6C6"/>
@@ -4757,7 +4789,7 @@
         </w:tc>
         <w:tc>
           <w:tcPr>
-            <w:tcW w:w="4371" w:type="dxa"/>
+            <w:tcW w:w="4504" w:type="dxa"/>
             <w:tcBorders>
               <w:top w:val="single" w:sz="4" w:space="0" w:color="C6C6C6"/>
               <w:left w:val="single" w:sz="4" w:space="0" w:color="C6C6C6"/>
@@ -4787,13 +4819,13 @@
                 <w:sz w:val="18"/>
                 <w:szCs w:val="18"/>
               </w:rPr>
-              <w:t xml:space="preserve">DeviceCtrl が Host へ要求を送信する</w:t>
+              <w:t xml:space="preserve">デバイス制御層（DeviceCtrl）が Host へ要求を送信する</w:t>
             </w:r>
           </w:p>
         </w:tc>
         <w:tc>
           <w:tcPr>
-            <w:tcW w:w="4507" w:type="dxa"/>
+            <w:tcW w:w="4374" w:type="dxa"/>
             <w:tcBorders>
               <w:top w:val="single" w:sz="4" w:space="0" w:color="C6C6C6"/>
               <w:left w:val="single" w:sz="4" w:space="0" w:color="C6C6C6"/>
@@ -4868,7 +4900,7 @@
         </w:tc>
         <w:tc>
           <w:tcPr>
-            <w:tcW w:w="4371" w:type="dxa"/>
+            <w:tcW w:w="4504" w:type="dxa"/>
             <w:tcBorders>
               <w:top w:val="single" w:sz="4" w:space="0" w:color="C6C6C6"/>
               <w:left w:val="single" w:sz="4" w:space="0" w:color="C6C6C6"/>
@@ -4904,7 +4936,7 @@
         </w:tc>
         <w:tc>
           <w:tcPr>
-            <w:tcW w:w="4507" w:type="dxa"/>
+            <w:tcW w:w="4374" w:type="dxa"/>
             <w:tcBorders>
               <w:top w:val="single" w:sz="4" w:space="0" w:color="C6C6C6"/>
               <w:left w:val="single" w:sz="4" w:space="0" w:color="C6C6C6"/>
@@ -4979,7 +5011,7 @@
         </w:tc>
         <w:tc>
           <w:tcPr>
-            <w:tcW w:w="4371" w:type="dxa"/>
+            <w:tcW w:w="4504" w:type="dxa"/>
             <w:tcBorders>
               <w:top w:val="single" w:sz="4" w:space="0" w:color="C6C6C6"/>
               <w:left w:val="single" w:sz="4" w:space="0" w:color="C6C6C6"/>
@@ -5015,7 +5047,7 @@
         </w:tc>
         <w:tc>
           <w:tcPr>
-            <w:tcW w:w="4507" w:type="dxa"/>
+            <w:tcW w:w="4374" w:type="dxa"/>
             <w:tcBorders>
               <w:top w:val="single" w:sz="4" w:space="0" w:color="C6C6C6"/>
               <w:left w:val="single" w:sz="4" w:space="0" w:color="C6C6C6"/>
@@ -5090,7 +5122,7 @@
         </w:tc>
         <w:tc>
           <w:tcPr>
-            <w:tcW w:w="4371" w:type="dxa"/>
+            <w:tcW w:w="4504" w:type="dxa"/>
             <w:tcBorders>
               <w:top w:val="single" w:sz="4" w:space="0" w:color="C6C6C6"/>
               <w:left w:val="single" w:sz="4" w:space="0" w:color="C6C6C6"/>
@@ -5126,7 +5158,7 @@
         </w:tc>
         <w:tc>
           <w:tcPr>
-            <w:tcW w:w="4507" w:type="dxa"/>
+            <w:tcW w:w="4374" w:type="dxa"/>
             <w:tcBorders>
               <w:top w:val="single" w:sz="4" w:space="0" w:color="C6C6C6"/>
               <w:left w:val="single" w:sz="4" w:space="0" w:color="C6C6C6"/>
@@ -5201,7 +5233,7 @@
         </w:tc>
         <w:tc>
           <w:tcPr>
-            <w:tcW w:w="4371" w:type="dxa"/>
+            <w:tcW w:w="4504" w:type="dxa"/>
             <w:tcBorders>
               <w:top w:val="single" w:sz="4" w:space="0" w:color="C6C6C6"/>
               <w:left w:val="single" w:sz="4" w:space="0" w:color="C6C6C6"/>
@@ -5237,7 +5269,7 @@
         </w:tc>
         <w:tc>
           <w:tcPr>
-            <w:tcW w:w="4507" w:type="dxa"/>
+            <w:tcW w:w="4374" w:type="dxa"/>
             <w:tcBorders>
               <w:top w:val="single" w:sz="4" w:space="0" w:color="C6C6C6"/>
               <w:left w:val="single" w:sz="4" w:space="0" w:color="C6C6C6"/>
@@ -5312,7 +5344,7 @@
         </w:tc>
         <w:tc>
           <w:tcPr>
-            <w:tcW w:w="4371" w:type="dxa"/>
+            <w:tcW w:w="4504" w:type="dxa"/>
             <w:tcBorders>
               <w:top w:val="single" w:sz="4" w:space="0" w:color="C6C6C6"/>
               <w:left w:val="single" w:sz="4" w:space="0" w:color="C6C6C6"/>
@@ -5348,7 +5380,7 @@
         </w:tc>
         <w:tc>
           <w:tcPr>
-            <w:tcW w:w="4507" w:type="dxa"/>
+            <w:tcW w:w="4374" w:type="dxa"/>
             <w:tcBorders>
               <w:top w:val="single" w:sz="4" w:space="0" w:color="C6C6C6"/>
               <w:left w:val="single" w:sz="4" w:space="0" w:color="C6C6C6"/>
@@ -5440,7 +5472,7 @@
         </w:tc>
         <w:tc>
           <w:tcPr>
-            <w:tcW w:w="4371" w:type="dxa"/>
+            <w:tcW w:w="4504" w:type="dxa"/>
             <w:tcBorders>
               <w:top w:val="single" w:sz="4" w:space="0" w:color="C6C6C6"/>
               <w:left w:val="single" w:sz="4" w:space="0" w:color="C6C6C6"/>
@@ -5476,7 +5508,7 @@
         </w:tc>
         <w:tc>
           <w:tcPr>
-            <w:tcW w:w="4507" w:type="dxa"/>
+            <w:tcW w:w="4374" w:type="dxa"/>
             <w:tcBorders>
               <w:top w:val="single" w:sz="4" w:space="0" w:color="C6C6C6"/>
               <w:left w:val="single" w:sz="4" w:space="0" w:color="C6C6C6"/>
@@ -5888,7 +5920,7 @@
         <w:rPr>
           <w:rFonts w:ascii="HG丸ｺﾞｼｯｸM-PRO" w:eastAsia="HG丸ｺﾞｼｯｸM-PRO" w:hAnsi="HG丸ｺﾞｼｯｸM-PRO" w:cs="HG丸ｺﾞｼｯｸM-PRO" w:hint="eastAsia"/>
         </w:rPr>
-        <w:t xml:space="preserve">4  Host 内部構成</w:t>
+        <w:t xml:space="preserve">4  デバイス接続サーバー（Host）内部構成</w:t>
       </w:r>
       <w:bookmarkEnd w:id="117"/>
     </w:p>
@@ -7755,8 +7787,8 @@
         <w:tblLook w:val="04A0" w:firstRow="1" w:lastRow="0" w:firstColumn="1" w:lastColumn="0" w:noHBand="0" w:noVBand="1"/>
       </w:tblPr>
       <w:tblGrid>
-        <w:gridCol w:w="2267"/>
-        <w:gridCol w:w="7371"/>
+        <w:gridCol w:w="2460"/>
+        <w:gridCol w:w="7178"/>
       </w:tblGrid>
       <w:tr>
         <w:trPr>
@@ -7764,7 +7796,7 @@
         </w:trPr>
         <w:tc>
           <w:tcPr>
-            <w:tcW w:w="2267" w:type="dxa"/>
+            <w:tcW w:w="2460" w:type="dxa"/>
             <w:tcBorders>
               <w:top w:val="single" w:sz="4" w:space="0" w:color="C6C6C6"/>
               <w:left w:val="single" w:sz="4" w:space="0" w:color="C6C6C6"/>
@@ -7802,7 +7834,7 @@
         </w:tc>
         <w:tc>
           <w:tcPr>
-            <w:tcW w:w="7371" w:type="dxa"/>
+            <w:tcW w:w="7178" w:type="dxa"/>
             <w:tcBorders>
               <w:top w:val="single" w:sz="4" w:space="0" w:color="C6C6C6"/>
               <w:left w:val="single" w:sz="4" w:space="0" w:color="C6C6C6"/>
@@ -7842,7 +7874,7 @@
       <w:tr>
         <w:tc>
           <w:tcPr>
-            <w:tcW w:w="2267" w:type="dxa"/>
+            <w:tcW w:w="2460" w:type="dxa"/>
             <w:tcBorders>
               <w:top w:val="single" w:sz="4" w:space="0" w:color="C6C6C6"/>
               <w:left w:val="single" w:sz="4" w:space="0" w:color="C6C6C6"/>
@@ -7879,7 +7911,7 @@
         </w:tc>
         <w:tc>
           <w:tcPr>
-            <w:tcW w:w="7371" w:type="dxa"/>
+            <w:tcW w:w="7178" w:type="dxa"/>
             <w:tcBorders>
               <w:top w:val="single" w:sz="4" w:space="0" w:color="C6C6C6"/>
               <w:left w:val="single" w:sz="4" w:space="0" w:color="C6C6C6"/>
@@ -7926,7 +7958,7 @@
       <w:tr>
         <w:tc>
           <w:tcPr>
-            <w:tcW w:w="2267" w:type="dxa"/>
+            <w:tcW w:w="2460" w:type="dxa"/>
             <w:tcBorders>
               <w:top w:val="single" w:sz="4" w:space="0" w:color="C6C6C6"/>
               <w:left w:val="single" w:sz="4" w:space="0" w:color="C6C6C6"/>
@@ -7963,7 +7995,7 @@
         </w:tc>
         <w:tc>
           <w:tcPr>
-            <w:tcW w:w="7371" w:type="dxa"/>
+            <w:tcW w:w="7178" w:type="dxa"/>
             <w:tcBorders>
               <w:top w:val="single" w:sz="4" w:space="0" w:color="C6C6C6"/>
               <w:left w:val="single" w:sz="4" w:space="0" w:color="C6C6C6"/>
@@ -8001,7 +8033,7 @@
       <w:tr>
         <w:tc>
           <w:tcPr>
-            <w:tcW w:w="2267" w:type="dxa"/>
+            <w:tcW w:w="2460" w:type="dxa"/>
             <w:tcBorders>
               <w:top w:val="single" w:sz="4" w:space="0" w:color="C6C6C6"/>
               <w:left w:val="single" w:sz="4" w:space="0" w:color="C6C6C6"/>
@@ -8038,7 +8070,7 @@
         </w:tc>
         <w:tc>
           <w:tcPr>
-            <w:tcW w:w="7371" w:type="dxa"/>
+            <w:tcW w:w="7178" w:type="dxa"/>
             <w:tcBorders>
               <w:top w:val="single" w:sz="4" w:space="0" w:color="C6C6C6"/>
               <w:left w:val="single" w:sz="4" w:space="0" w:color="C6C6C6"/>
@@ -8068,7 +8100,7 @@
                 <w:sz w:val="18"/>
                 <w:szCs w:val="18"/>
               </w:rPr>
-              <w:t xml:space="preserve">legacy class factory が生成するデバイス class ID</w:t>
+              <w:t xml:space="preserve">既存 class factory が生成するデバイス class ID</w:t>
             </w:r>
           </w:p>
         </w:tc>
@@ -8076,7 +8108,7 @@
       <w:tr>
         <w:tc>
           <w:tcPr>
-            <w:tcW w:w="2267" w:type="dxa"/>
+            <w:tcW w:w="2460" w:type="dxa"/>
             <w:tcBorders>
               <w:top w:val="single" w:sz="4" w:space="0" w:color="C6C6C6"/>
               <w:left w:val="single" w:sz="4" w:space="0" w:color="C6C6C6"/>
@@ -8113,7 +8145,7 @@
         </w:tc>
         <w:tc>
           <w:tcPr>
-            <w:tcW w:w="7371" w:type="dxa"/>
+            <w:tcW w:w="7178" w:type="dxa"/>
             <w:tcBorders>
               <w:top w:val="single" w:sz="4" w:space="0" w:color="C6C6C6"/>
               <w:left w:val="single" w:sz="4" w:space="0" w:color="C6C6C6"/>
@@ -8151,7 +8183,7 @@
       <w:tr>
         <w:tc>
           <w:tcPr>
-            <w:tcW w:w="2267" w:type="dxa"/>
+            <w:tcW w:w="2460" w:type="dxa"/>
             <w:tcBorders>
               <w:top w:val="single" w:sz="4" w:space="0" w:color="C6C6C6"/>
               <w:left w:val="single" w:sz="4" w:space="0" w:color="C6C6C6"/>
@@ -8188,7 +8220,7 @@
         </w:tc>
         <w:tc>
           <w:tcPr>
-            <w:tcW w:w="7371" w:type="dxa"/>
+            <w:tcW w:w="7178" w:type="dxa"/>
             <w:tcBorders>
               <w:top w:val="single" w:sz="4" w:space="0" w:color="C6C6C6"/>
               <w:left w:val="single" w:sz="4" w:space="0" w:color="C6C6C6"/>
@@ -8331,7 +8363,7 @@
         <w:rPr>
           <w:rFonts w:ascii="HG丸ｺﾞｼｯｸM-PRO" w:eastAsia="HG丸ｺﾞｼｯｸM-PRO" w:hAnsi="HG丸ｺﾞｼｯｸM-PRO" w:cs="HG丸ｺﾞｼｯｸM-PRO" w:hint="eastAsia"/>
         </w:rPr>
-        <w:t xml:space="preserve"> はタブレットPOSアプリ側の DeviceCtrl 設定である。</w:t>
+        <w:t xml:space="preserve"> はタブレットPOSアプリ側のデバイス制御層（DeviceCtrl）設定である。</w:t>
       </w:r>
     </w:p>
     <w:p>
@@ -8375,7 +8407,7 @@
         <w:rPr>
           <w:rFonts w:ascii="HG丸ｺﾞｼｯｸM-PRO" w:eastAsia="HG丸ｺﾞｼｯｸM-PRO" w:hAnsi="HG丸ｺﾞｼｯｸM-PRO" w:cs="HG丸ｺﾞｼｯｸM-PRO" w:hint="eastAsia"/>
         </w:rPr>
-        <w:t xml:space="preserve"> を指定し、DeviceCtrl からデバイス接続サーバーへ要求を送信する。</w:t>
+        <w:t xml:space="preserve"> を指定し、デバイス制御層からデバイス接続サーバーへ要求を送信する。</w:t>
       </w:r>
     </w:p>
     <w:p>
@@ -8438,7 +8470,7 @@
         <w:rPr>
           <w:rFonts w:ascii="HG丸ｺﾞｼｯｸM-PRO" w:eastAsia="HG丸ｺﾞｼｯｸM-PRO" w:hAnsi="HG丸ｺﾞｼｯｸM-PRO" w:cs="HG丸ｺﾞｼｯｸM-PRO" w:hint="eastAsia"/>
         </w:rPr>
-        <w:t xml:space="preserve">6  初期対象デバイス</w:t>
+        <w:t xml:space="preserve">6  初期対象デバイスと機種追加方針</w:t>
       </w:r>
       <w:bookmarkEnd w:id="124"/>
     </w:p>
@@ -8960,7 +8992,35 @@
         <w:rPr>
           <w:rFonts w:ascii="HG丸ｺﾞｼｯｸM-PRO" w:eastAsia="HG丸ｺﾞｼｯｸM-PRO" w:hAnsi="HG丸ｺﾞｼｯｸM-PRO" w:cs="HG丸ｺﾞｼｯｸM-PRO" w:hint="eastAsia"/>
         </w:rPr>
-        <w:t xml:space="preserve">上記以外の機器は、初期段階では DeviceCtrl 内または各 platform の strategy で直接制御する。</w:t>
+        <w:t xml:space="preserve">上記の対象デバイスは、現行 POS で使用している既存デバイスを継続利用するためにデバイス接続サーバー（Host）経由とする。</w:t>
+      </w:r>
+    </w:p>
+    <w:p>
+      <w:pPr>
+        <w:pStyle w:val="FXSS7"/>
+        <w:rPr>
+          <w:rFonts w:ascii="HG丸ｺﾞｼｯｸM-PRO" w:eastAsia="HG丸ｺﾞｼｯｸM-PRO" w:hAnsi="HG丸ｺﾞｼｯｸM-PRO" w:cs="HG丸ｺﾞｼｯｸM-PRO"/>
+        </w:rPr>
+      </w:pPr>
+      <w:r>
+        <w:rPr>
+          <w:rFonts w:ascii="HG丸ｺﾞｼｯｸM-PRO" w:eastAsia="HG丸ｺﾞｼｯｸM-PRO" w:hAnsi="HG丸ｺﾞｼｯｸM-PRO" w:cs="HG丸ｺﾞｼｯｸM-PRO" w:hint="eastAsia"/>
+        </w:rPr>
+        <w:t xml:space="preserve">機種追加時は、原則として iPad と同等の直接制御方式で対応し、新たなレガシーデバイスをデバイス接続サーバー（Host）へ追加しない。RZ-476 など対象機器の利用が終了した後は、デバイス接続サーバー（Host）は不要となる資材として整理できる。</w:t>
+      </w:r>
+    </w:p>
+    <w:p>
+      <w:pPr>
+        <w:pStyle w:val="FXSS7"/>
+        <w:rPr>
+          <w:rFonts w:ascii="HG丸ｺﾞｼｯｸM-PRO" w:eastAsia="HG丸ｺﾞｼｯｸM-PRO" w:hAnsi="HG丸ｺﾞｼｯｸM-PRO" w:cs="HG丸ｺﾞｼｯｸM-PRO"/>
+        </w:rPr>
+      </w:pPr>
+      <w:r>
+        <w:rPr>
+          <w:rFonts w:ascii="HG丸ｺﾞｼｯｸM-PRO" w:eastAsia="HG丸ｺﾞｼｯｸM-PRO" w:hAnsi="HG丸ｺﾞｼｯｸM-PRO" w:cs="HG丸ｺﾞｼｯｸM-PRO" w:hint="eastAsia"/>
+        </w:rPr>
+        <w:t xml:space="preserve">上記以外の機器は、初期段階ではデバイス制御層（DeviceCtrl）内または各プラットフォームの制御部品で直接制御する。</w:t>
       </w:r>
     </w:p>
     <w:p>
@@ -9022,8 +9082,8 @@
         <w:tblLook w:val="04A0" w:firstRow="1" w:lastRow="0" w:firstColumn="1" w:lastColumn="0" w:noHBand="0" w:noVBand="1"/>
       </w:tblPr>
       <w:tblGrid>
-        <w:gridCol w:w="887"/>
-        <w:gridCol w:w="8751"/>
+        <w:gridCol w:w="760"/>
+        <w:gridCol w:w="8878"/>
       </w:tblGrid>
       <w:tr>
         <w:trPr>
@@ -9031,7 +9091,7 @@
         </w:trPr>
         <w:tc>
           <w:tcPr>
-            <w:tcW w:w="887" w:type="dxa"/>
+            <w:tcW w:w="760" w:type="dxa"/>
             <w:tcBorders>
               <w:top w:val="single" w:sz="4" w:space="0" w:color="C6C6C6"/>
               <w:left w:val="single" w:sz="4" w:space="0" w:color="C6C6C6"/>
@@ -9069,7 +9129,7 @@
         </w:tc>
         <w:tc>
           <w:tcPr>
-            <w:tcW w:w="8751" w:type="dxa"/>
+            <w:tcW w:w="8878" w:type="dxa"/>
             <w:tcBorders>
               <w:top w:val="single" w:sz="4" w:space="0" w:color="C6C6C6"/>
               <w:left w:val="single" w:sz="4" w:space="0" w:color="C6C6C6"/>
@@ -9109,7 +9169,7 @@
       <w:tr>
         <w:tc>
           <w:tcPr>
-            <w:tcW w:w="887" w:type="dxa"/>
+            <w:tcW w:w="760" w:type="dxa"/>
             <w:tcBorders>
               <w:top w:val="single" w:sz="4" w:space="0" w:color="C6C6C6"/>
               <w:left w:val="single" w:sz="4" w:space="0" w:color="C6C6C6"/>
@@ -9145,7 +9205,7 @@
         </w:tc>
         <w:tc>
           <w:tcPr>
-            <w:tcW w:w="8751" w:type="dxa"/>
+            <w:tcW w:w="8878" w:type="dxa"/>
             <w:tcBorders>
               <w:top w:val="single" w:sz="4" w:space="0" w:color="C6C6C6"/>
               <w:left w:val="single" w:sz="4" w:space="0" w:color="C6C6C6"/>
@@ -9171,6 +9231,14 @@
             </w:pPr>
             <w:r>
               <w:rPr>
+                <w:rFonts w:ascii="HG丸ｺﾞｼｯｸM-PRO" w:eastAsia="HG丸ｺﾞｼｯｸM-PRO" w:hAnsi="HG丸ｺﾞｼｯｸM-PRO" w:cs="HG丸ｺﾞｼｯｸM-PRO" w:hint="eastAsia"/>
+                <w:sz w:val="18"/>
+                <w:szCs w:val="18"/>
+              </w:rPr>
+              <w:t xml:space="preserve">タブレットPOSアプリのライフサイクルに合わせて Host が自動起動し、</w:t>
+            </w:r>
+            <w:r>
+              <w:rPr>
                 <w:rFonts w:ascii="Consolas" w:eastAsia="Consolas" w:hAnsi="Consolas" w:cs="Consolas"/>
                 <w:sz w:val="18"/>
                 <w:szCs w:val="18"/>
@@ -9192,7 +9260,7 @@
       <w:tr>
         <w:tc>
           <w:tcPr>
-            <w:tcW w:w="887" w:type="dxa"/>
+            <w:tcW w:w="760" w:type="dxa"/>
             <w:tcBorders>
               <w:top w:val="single" w:sz="4" w:space="0" w:color="C6C6C6"/>
               <w:left w:val="single" w:sz="4" w:space="0" w:color="C6C6C6"/>
@@ -9228,7 +9296,7 @@
         </w:tc>
         <w:tc>
           <w:tcPr>
-            <w:tcW w:w="8751" w:type="dxa"/>
+            <w:tcW w:w="8878" w:type="dxa"/>
             <w:tcBorders>
               <w:top w:val="single" w:sz="4" w:space="0" w:color="C6C6C6"/>
               <w:left w:val="single" w:sz="4" w:space="0" w:color="C6C6C6"/>
@@ -9292,7 +9360,7 @@
       <w:tr>
         <w:tc>
           <w:tcPr>
-            <w:tcW w:w="887" w:type="dxa"/>
+            <w:tcW w:w="760" w:type="dxa"/>
             <w:tcBorders>
               <w:top w:val="single" w:sz="4" w:space="0" w:color="C6C6C6"/>
               <w:left w:val="single" w:sz="4" w:space="0" w:color="C6C6C6"/>
@@ -9328,7 +9396,7 @@
         </w:tc>
         <w:tc>
           <w:tcPr>
-            <w:tcW w:w="8751" w:type="dxa"/>
+            <w:tcW w:w="8878" w:type="dxa"/>
             <w:tcBorders>
               <w:top w:val="single" w:sz="4" w:space="0" w:color="C6C6C6"/>
               <w:left w:val="single" w:sz="4" w:space="0" w:color="C6C6C6"/>
@@ -9392,7 +9460,7 @@
       <w:tr>
         <w:tc>
           <w:tcPr>
-            <w:tcW w:w="887" w:type="dxa"/>
+            <w:tcW w:w="760" w:type="dxa"/>
             <w:tcBorders>
               <w:top w:val="single" w:sz="4" w:space="0" w:color="C6C6C6"/>
               <w:left w:val="single" w:sz="4" w:space="0" w:color="C6C6C6"/>
@@ -9428,7 +9496,7 @@
         </w:tc>
         <w:tc>
           <w:tcPr>
-            <w:tcW w:w="8751" w:type="dxa"/>
+            <w:tcW w:w="8878" w:type="dxa"/>
             <w:tcBorders>
               <w:top w:val="single" w:sz="4" w:space="0" w:color="C6C6C6"/>
               <w:left w:val="single" w:sz="4" w:space="0" w:color="C6C6C6"/>
@@ -9483,7 +9551,7 @@
       <w:tr>
         <w:tc>
           <w:tcPr>
-            <w:tcW w:w="887" w:type="dxa"/>
+            <w:tcW w:w="760" w:type="dxa"/>
             <w:tcBorders>
               <w:top w:val="single" w:sz="4" w:space="0" w:color="C6C6C6"/>
               <w:left w:val="single" w:sz="4" w:space="0" w:color="C6C6C6"/>
@@ -9519,7 +9587,7 @@
         </w:tc>
         <w:tc>
           <w:tcPr>
-            <w:tcW w:w="8751" w:type="dxa"/>
+            <w:tcW w:w="8878" w:type="dxa"/>
             <w:tcBorders>
               <w:top w:val="single" w:sz="4" w:space="0" w:color="C6C6C6"/>
               <w:left w:val="single" w:sz="4" w:space="0" w:color="C6C6C6"/>
@@ -9617,7 +9685,7 @@
       <w:tr>
         <w:tc>
           <w:tcPr>
-            <w:tcW w:w="887" w:type="dxa"/>
+            <w:tcW w:w="760" w:type="dxa"/>
             <w:tcBorders>
               <w:top w:val="single" w:sz="4" w:space="0" w:color="C6C6C6"/>
               <w:left w:val="single" w:sz="4" w:space="0" w:color="C6C6C6"/>
@@ -9653,7 +9721,7 @@
         </w:tc>
         <w:tc>
           <w:tcPr>
-            <w:tcW w:w="8751" w:type="dxa"/>
+            <w:tcW w:w="8878" w:type="dxa"/>
             <w:tcBorders>
               <w:top w:val="single" w:sz="4" w:space="0" w:color="C6C6C6"/>
               <w:left w:val="single" w:sz="4" w:space="0" w:color="C6C6C6"/>
@@ -9710,6 +9778,80 @@
                 <w:szCs w:val="18"/>
               </w:rPr>
               <w:t xml:space="preserve"> により pipe と起動済みデバイスが終了すること</w:t>
+            </w:r>
+          </w:p>
+        </w:tc>
+      </w:tr>
+      <w:tr>
+        <w:tc>
+          <w:tcPr>
+            <w:tcW w:w="760" w:type="dxa"/>
+            <w:tcBorders>
+              <w:top w:val="single" w:sz="4" w:space="0" w:color="C6C6C6"/>
+              <w:left w:val="single" w:sz="4" w:space="0" w:color="C6C6C6"/>
+              <w:bottom w:val="single" w:sz="4" w:space="0" w:color="C6C6C6"/>
+              <w:right w:val="single" w:sz="4" w:space="0" w:color="C6C6C6"/>
+            </w:tcBorders>
+            <w:tcMar>
+              <w:top w:w="30" w:type="dxa"/>
+              <w:left w:w="80" w:type="dxa"/>
+              <w:bottom w:w="30" w:type="dxa"/>
+              <w:right w:w="80" w:type="dxa"/>
+            </w:tcMar>
+            <w:vAlign w:val="center"/>
+          </w:tcPr>
+          <w:p>
+            <w:pPr>
+              <w:spacing w:before="0" w:after="0" w:line="240" w:lineRule="auto"/>
+              <w:jc w:val="left"/>
+              <w:rPr>
+                <w:rFonts w:ascii="HG丸ｺﾞｼｯｸM-PRO" w:eastAsia="HG丸ｺﾞｼｯｸM-PRO" w:hAnsi="HG丸ｺﾞｼｯｸM-PRO" w:cs="HG丸ｺﾞｼｯｸM-PRO" w:hint="eastAsia"/>
+                <w:sz w:val="18"/>
+              </w:rPr>
+            </w:pPr>
+            <w:r>
+              <w:rPr>
+                <w:rFonts w:ascii="HG丸ｺﾞｼｯｸM-PRO" w:eastAsia="HG丸ｺﾞｼｯｸM-PRO" w:hAnsi="HG丸ｺﾞｼｯｸM-PRO" w:cs="HG丸ｺﾞｼｯｸM-PRO" w:hint="eastAsia"/>
+                <w:sz w:val="18"/>
+                <w:szCs w:val="18"/>
+              </w:rPr>
+              <w:t xml:space="preserve">画面表示</w:t>
+            </w:r>
+          </w:p>
+        </w:tc>
+        <w:tc>
+          <w:tcPr>
+            <w:tcW w:w="8878" w:type="dxa"/>
+            <w:tcBorders>
+              <w:top w:val="single" w:sz="4" w:space="0" w:color="C6C6C6"/>
+              <w:left w:val="single" w:sz="4" w:space="0" w:color="C6C6C6"/>
+              <w:bottom w:val="single" w:sz="4" w:space="0" w:color="C6C6C6"/>
+              <w:right w:val="single" w:sz="4" w:space="0" w:color="C6C6C6"/>
+            </w:tcBorders>
+            <w:tcMar>
+              <w:top w:w="30" w:type="dxa"/>
+              <w:left w:w="80" w:type="dxa"/>
+              <w:bottom w:w="30" w:type="dxa"/>
+              <w:right w:w="80" w:type="dxa"/>
+            </w:tcMar>
+            <w:vAlign w:val="center"/>
+          </w:tcPr>
+          <w:p>
+            <w:pPr>
+              <w:spacing w:before="0" w:after="0" w:line="240" w:lineRule="auto"/>
+              <w:jc w:val="left"/>
+              <w:rPr>
+                <w:rFonts w:ascii="HG丸ｺﾞｼｯｸM-PRO" w:eastAsia="HG丸ｺﾞｼｯｸM-PRO" w:hAnsi="HG丸ｺﾞｼｯｸM-PRO" w:cs="HG丸ｺﾞｼｯｸM-PRO" w:hint="eastAsia"/>
+                <w:sz w:val="18"/>
+              </w:rPr>
+            </w:pPr>
+            <w:r>
+              <w:rPr>
+                <w:rFonts w:ascii="HG丸ｺﾞｼｯｸM-PRO" w:eastAsia="HG丸ｺﾞｼｯｸM-PRO" w:hAnsi="HG丸ｺﾞｼｯｸM-PRO" w:cs="HG丸ｺﾞｼｯｸM-PRO" w:hint="eastAsia"/>
+                <w:sz w:val="18"/>
+                <w:szCs w:val="18"/>
+              </w:rPr>
+              <w:t xml:space="preserve">Start/Stop 画面はデバッグ／開発者向けに限定し、通常運用時には表示しないこと</w:t>
             </w:r>
           </w:p>
         </w:tc>
@@ -10265,7 +10407,7 @@
               <w:sz w:val="20"/>
               <w:szCs w:val="20"/>
             </w:rPr>
-            <w:t xml:space="preserve">文書名：ARCH-03_タブレットPOS_デバイス接続サーバー構造設計書</w:t>
+            <w:t xml:space="preserve">文書名：タブレットPOS デバイス接続サーバー構造設計書</w:t>
           </w:r>
         </w:p>
       </w:tc>
@@ -10321,7 +10463,7 @@
               <w:sz w:val="18"/>
               <w:szCs w:val="18"/>
             </w:rPr>
-            <w:t xml:space="preserve">図番：-</w:t>
+            <w:t xml:space="preserve">図番：ARCH-03</w:t>
           </w:r>
         </w:p>
       </w:tc>
@@ -10348,7 +10490,7 @@
               <w:sz w:val="18"/>
               <w:szCs w:val="18"/>
             </w:rPr>
-            <w:t xml:space="preserve">更新日：2026/06/19</w:t>
+            <w:t xml:space="preserve">更新日：2026/06/24</w:t>
           </w:r>
         </w:p>
       </w:tc>

</xml_diff>